<commit_message>
my brain finally works
</commit_message>
<xml_diff>
--- a/bec/BEC_Investigation_projectvictoria.docx
+++ b/bec/BEC_Investigation_projectvictoria.docx
@@ -215,21 +215,9 @@
             </w:pPr>
             <w:r>
               <w:rPr/>
-              <w:t xml:space="preserve">Naomi Hunter </w:t>
-            </w:r>
-            <w:r>
-              <w:rPr/>
-              <w:t>(targeted counterparty)</w:t>
-            </w:r>
-            <w:r>
-              <w:rPr/>
-              <w:t xml:space="preserve">, </w:t>
+              <w:t xml:space="preserve">Naomi Hunter (targeted counterparty), </w:t>
               <w:br/>
-              <w:t xml:space="preserve">Donald Anderson </w:t>
-            </w:r>
-            <w:r>
-              <w:rPr/>
-              <w:t>(compromised)</w:t>
+              <w:t>Donald Anderson (compromised)</w:t>
             </w:r>
           </w:p>
         </w:tc>
@@ -286,15 +274,7 @@
                 <w:sz w:val="20"/>
                 <w:szCs w:val="20"/>
               </w:rPr>
-              <w:t>2026-03-07  —  2026-03-1</w:t>
-            </w:r>
-            <w:r>
-              <w:rPr>
-                <w:color w:val="BBBBBB"/>
-                <w:sz w:val="20"/>
-                <w:szCs w:val="20"/>
-              </w:rPr>
-              <w:t>5</w:t>
+              <w:t>2026-03-07  —  2026-03-15</w:t>
             </w:r>
           </w:p>
         </w:tc>
@@ -431,19 +411,6 @@
       <w:r>
         <w:rPr/>
         <w:t>Attack Narrative (Executive Summary)</w:t>
-      </w:r>
-    </w:p>
-    <w:p>
-      <w:pPr>
-        <w:pStyle w:val="Normal"/>
-        <w:spacing w:before="0" w:after="80"/>
-        <w:rPr/>
-      </w:pPr>
-      <w:r>
-        <w:rPr>
-          <w:color w:val="AAAAAA"/>
-        </w:rPr>
-        <w:t>A summary of the full incident — what happened, how, and the outcome. ** very high level overview</w:t>
       </w:r>
     </w:p>
     <w:p>
@@ -488,19 +455,6 @@
       <w:r>
         <w:rPr/>
         <w:t>Timeline of Events</w:t>
-      </w:r>
-    </w:p>
-    <w:p>
-      <w:pPr>
-        <w:pStyle w:val="Normal"/>
-        <w:spacing w:before="0" w:after="80"/>
-        <w:rPr/>
-      </w:pPr>
-      <w:r>
-        <w:rPr>
-          <w:color w:val="AAAAAA"/>
-        </w:rPr>
-        <w:t>All unauthorised and relevant activity.</w:t>
       </w:r>
     </w:p>
     <w:p>
@@ -657,15 +611,7 @@
             </w:pPr>
             <w:r>
               <w:rPr/>
-              <w:t xml:space="preserve">12:49:55 </w:t>
-            </w:r>
-            <w:r>
-              <w:rPr/>
-              <w:t>P</w:t>
-            </w:r>
-            <w:r>
-              <w:rPr/>
-              <w:t>M.</w:t>
+              <w:t>12:49:55 PM.</w:t>
             </w:r>
           </w:p>
         </w:tc>
@@ -2015,19 +1961,6 @@
         <w:rPr/>
       </w:pPr>
       <w:r>
-        <w:rPr>
-          <w:color w:val="AAAAAA"/>
-        </w:rPr>
-        <w:t>How did the unauthorised party gain access? Note the initial access vector, first confirmed malicious sign-in — source IP, application used, timestamp.</w:t>
-      </w:r>
-    </w:p>
-    <w:p>
-      <w:pPr>
-        <w:pStyle w:val="Normal"/>
-        <w:spacing w:before="0" w:after="80"/>
-        <w:rPr/>
-      </w:pPr>
-      <w:r>
         <w:rPr/>
       </w:r>
     </w:p>
@@ -2069,15 +2002,6 @@
             </w:pPr>
             <w:r>
               <w:rPr>
-                <w:color w:val="BBBBBB"/>
-                <w:sz w:val="20"/>
-                <w:szCs w:val="20"/>
-              </w:rPr>
-              <w:t>First malicious IP / sign-in event / application used…</w:t>
-              <w:br/>
-            </w:r>
-            <w:r>
-              <w:rPr>
                 <w:color w:val="000000"/>
                 <w:sz w:val="20"/>
                 <w:szCs w:val="20"/>
@@ -2137,19 +2061,6 @@
       <w:r>
         <w:rPr/>
         <w:t>3.2  Unauthorised Activity</w:t>
-      </w:r>
-    </w:p>
-    <w:p>
-      <w:pPr>
-        <w:pStyle w:val="Normal"/>
-        <w:spacing w:before="0" w:after="80"/>
-        <w:rPr/>
-      </w:pPr>
-      <w:r>
-        <w:rPr>
-          <w:color w:val="AAAAAA"/>
-        </w:rPr>
-        <w:t>What did the unauthorised party do once inside? Inbox rules, sent emails, Teams activity, account changes. Reference master search results.</w:t>
       </w:r>
     </w:p>
     <w:p>
@@ -2204,15 +2115,6 @@
             </w:pPr>
             <w:r>
               <w:rPr>
-                <w:color w:val="BBBBBB"/>
-                <w:sz w:val="20"/>
-                <w:szCs w:val="20"/>
-              </w:rPr>
-              <w:t>Document activity in chronological order, referencing the timeline above…</w:t>
-              <w:br/>
-            </w:r>
-            <w:r>
-              <w:rPr>
                 <w:color w:val="000000"/>
                 <w:sz w:val="20"/>
                 <w:szCs w:val="20"/>
@@ -2278,19 +2180,6 @@
       <w:r>
         <w:rPr/>
         <w:t>3.3  Data Access</w:t>
-      </w:r>
-    </w:p>
-    <w:p>
-      <w:pPr>
-        <w:pStyle w:val="Normal"/>
-        <w:spacing w:before="0" w:after="80"/>
-        <w:rPr/>
-      </w:pPr>
-      <w:r>
-        <w:rPr>
-          <w:color w:val="AAAAAA"/>
-        </w:rPr>
-        <w:t xml:space="preserve">What data was accessed or potentially exfiltrated? </w:t>
       </w:r>
     </w:p>
     <w:p>
@@ -2341,15 +2230,6 @@
             </w:pPr>
             <w:r>
               <w:rPr>
-                <w:color w:val="BBBBBB"/>
-                <w:sz w:val="20"/>
-                <w:szCs w:val="20"/>
-              </w:rPr>
-              <w:t>Exchange: MailItemsAccessed events (bind / sync)...  SharePoint / OneDrive: FileAccessed, FileSyncDownloadedFull, sharing links…</w:t>
-              <w:br/>
-            </w:r>
-            <w:r>
-              <w:rPr>
                 <w:color w:val="000000"/>
                 <w:sz w:val="20"/>
                 <w:szCs w:val="20"/>
@@ -2480,19 +2360,6 @@
       <w:r>
         <w:rPr/>
         <w:t>Lessons Learned</w:t>
-      </w:r>
-    </w:p>
-    <w:p>
-      <w:pPr>
-        <w:pStyle w:val="Normal"/>
-        <w:spacing w:before="0" w:after="80"/>
-        <w:rPr/>
-      </w:pPr>
-      <w:r>
-        <w:rPr>
-          <w:color w:val="AAAAAA"/>
-        </w:rPr>
-        <w:t>What would you approach differently? Where did you take a longer path than needed? What does this case teach you that you carry into the next one?</w:t>
       </w:r>
     </w:p>
     <w:p>

</xml_diff>